<commit_message>
Demarcating the theoretical scope of the project
</commit_message>
<xml_diff>
--- a/Documentatiion/On the possibility of a morally sound LLM.docx
+++ b/Documentatiion/On the possibility of a morally sound LLM.docx
@@ -569,7 +569,6 @@
         </w:rPr>
         <w:t xml:space="preserve">not to follow its command) or </w:t>
       </w:r>
-      <w:proofErr w:type="spellStart"/>
       <w:r>
         <w:rPr>
           <w:i/>
@@ -580,7 +579,6 @@
         </w:rPr>
         <w:t>impositive</w:t>
       </w:r>
-      <w:proofErr w:type="spellEnd"/>
       <w:r>
         <w:rPr>
           <w:sz w:val="22"/>
@@ -687,23 +685,13 @@
           <w:lang w:val="en-GB"/>
         </w:rPr>
       </w:pPr>
-      <w:proofErr w:type="spellStart"/>
       <w:r>
         <w:rPr>
           <w:rFonts w:ascii="Arial" w:hAnsi="Arial" w:cs="Arial"/>
           <w:sz w:val="16"/>
           <w:szCs w:val="16"/>
         </w:rPr>
-        <w:t>Figure</w:t>
-      </w:r>
-      <w:proofErr w:type="spellEnd"/>
-      <w:r>
-        <w:rPr>
-          <w:rFonts w:ascii="Arial" w:hAnsi="Arial" w:cs="Arial"/>
-          <w:sz w:val="16"/>
-          <w:szCs w:val="16"/>
-        </w:rPr>
-        <w:t xml:space="preserve"> </w:t>
+        <w:t xml:space="preserve">Figure </w:t>
       </w:r>
       <w:r>
         <w:rPr>
@@ -752,36 +740,68 @@
           <w:sz w:val="16"/>
           <w:szCs w:val="16"/>
         </w:rPr>
-        <w:t xml:space="preserve">. </w:t>
-      </w:r>
-      <w:proofErr w:type="spellStart"/>
-      <w:r>
-        <w:rPr>
-          <w:rFonts w:ascii="Arial" w:hAnsi="Arial" w:cs="Arial"/>
-          <w:sz w:val="16"/>
-          <w:szCs w:val="16"/>
-        </w:rPr>
-        <w:t>Classification</w:t>
-      </w:r>
-      <w:proofErr w:type="spellEnd"/>
-      <w:r>
-        <w:rPr>
-          <w:rFonts w:ascii="Arial" w:hAnsi="Arial" w:cs="Arial"/>
-          <w:sz w:val="16"/>
-          <w:szCs w:val="16"/>
-        </w:rPr>
-        <w:t xml:space="preserve"> of </w:t>
-      </w:r>
-      <w:proofErr w:type="spellStart"/>
-      <w:r>
-        <w:rPr>
-          <w:rFonts w:ascii="Arial" w:hAnsi="Arial" w:cs="Arial"/>
-          <w:sz w:val="16"/>
-          <w:szCs w:val="16"/>
-        </w:rPr>
-        <w:t>laws</w:t>
-      </w:r>
-      <w:proofErr w:type="spellEnd"/>
+        <w:t>. Classification of laws</w:t>
+      </w:r>
+    </w:p>
+    <w:p>
+      <w:pPr>
+        <w:pStyle w:val="Narracions"/>
+        <w:rPr>
+          <w:sz w:val="22"/>
+          <w:szCs w:val="20"/>
+          <w:lang w:val="en-GB"/>
+        </w:rPr>
+      </w:pPr>
+      <w:r>
+        <w:rPr>
+          <w:b/>
+          <w:bCs/>
+          <w:sz w:val="22"/>
+          <w:szCs w:val="20"/>
+          <w:lang w:val="en-GB"/>
+        </w:rPr>
+        <w:t>Laws of a divine origin will not be observed</w:t>
+      </w:r>
+      <w:r>
+        <w:rPr>
+          <w:sz w:val="22"/>
+          <w:szCs w:val="20"/>
+          <w:lang w:val="en-GB"/>
+        </w:rPr>
+        <w:t xml:space="preserve">, as it would </w:t>
+      </w:r>
+      <w:r>
+        <w:rPr>
+          <w:sz w:val="22"/>
+          <w:szCs w:val="20"/>
+          <w:lang w:val="en-GB"/>
+        </w:rPr>
+        <w:t>require</w:t>
+      </w:r>
+      <w:r>
+        <w:rPr>
+          <w:sz w:val="22"/>
+          <w:szCs w:val="20"/>
+          <w:lang w:val="en-GB"/>
+        </w:rPr>
+        <w:t xml:space="preserve"> </w:t>
+      </w:r>
+      <w:r>
+        <w:rPr>
+          <w:sz w:val="22"/>
+          <w:szCs w:val="20"/>
+          <w:lang w:val="en-GB"/>
+        </w:rPr>
+        <w:t xml:space="preserve">choosing one religion or finding a set of </w:t>
+      </w:r>
+      <w:r>
+        <w:rPr>
+          <w:sz w:val="22"/>
+          <w:szCs w:val="20"/>
+          <w:lang w:val="en-GB"/>
+        </w:rPr>
+        <w:t>directives common in at least most doctrines.</w:t>
+      </w:r>
     </w:p>
     <w:p>
       <w:pPr>
@@ -803,6 +823,7 @@
           <w:szCs w:val="20"/>
           <w:lang w:val="en-GB"/>
         </w:rPr>
+        <w:lastRenderedPageBreak/>
         <w:t>2</w:t>
       </w:r>
       <w:r>
@@ -832,7 +853,6 @@
           <w:szCs w:val="20"/>
           <w:lang w:val="en-GB"/>
         </w:rPr>
-        <w:lastRenderedPageBreak/>
         <w:t xml:space="preserve">A law entails a sanction, which is </w:t>
       </w:r>
       <w:r>
@@ -937,25 +957,7 @@
           <w:szCs w:val="20"/>
           <w:lang w:val="en-GB"/>
         </w:rPr>
-        <w:t xml:space="preserve"> (a favourable or </w:t>
-      </w:r>
-      <w:proofErr w:type="spellStart"/>
-      <w:r>
-        <w:rPr>
-          <w:sz w:val="22"/>
-          <w:szCs w:val="20"/>
-          <w:lang w:val="en-GB"/>
-        </w:rPr>
-        <w:t>disfavourable</w:t>
-      </w:r>
-      <w:proofErr w:type="spellEnd"/>
-      <w:r>
-        <w:rPr>
-          <w:sz w:val="22"/>
-          <w:szCs w:val="20"/>
-          <w:lang w:val="en-GB"/>
-        </w:rPr>
-        <w:t xml:space="preserve"> </w:t>
+        <w:t xml:space="preserve"> (a favourable or disfavourable </w:t>
       </w:r>
       <w:r>
         <w:rPr>
@@ -1206,23 +1208,13 @@
           <w:szCs w:val="16"/>
         </w:rPr>
       </w:pPr>
-      <w:proofErr w:type="spellStart"/>
       <w:r>
         <w:rPr>
           <w:rFonts w:ascii="Arial" w:hAnsi="Arial" w:cs="Arial"/>
           <w:sz w:val="16"/>
           <w:szCs w:val="16"/>
         </w:rPr>
-        <w:t>Figure</w:t>
-      </w:r>
-      <w:proofErr w:type="spellEnd"/>
-      <w:r>
-        <w:rPr>
-          <w:rFonts w:ascii="Arial" w:hAnsi="Arial" w:cs="Arial"/>
-          <w:sz w:val="16"/>
-          <w:szCs w:val="16"/>
-        </w:rPr>
-        <w:t xml:space="preserve"> </w:t>
+        <w:t xml:space="preserve">Figure </w:t>
       </w:r>
       <w:r>
         <w:rPr>
@@ -1271,25 +1263,7 @@
           <w:sz w:val="16"/>
           <w:szCs w:val="16"/>
         </w:rPr>
-        <w:t xml:space="preserve">. </w:t>
-      </w:r>
-      <w:proofErr w:type="spellStart"/>
-      <w:r>
-        <w:rPr>
-          <w:rFonts w:ascii="Arial" w:hAnsi="Arial" w:cs="Arial"/>
-          <w:sz w:val="16"/>
-          <w:szCs w:val="16"/>
-        </w:rPr>
-        <w:t>Classification</w:t>
-      </w:r>
-      <w:proofErr w:type="spellEnd"/>
-      <w:r>
-        <w:rPr>
-          <w:rFonts w:ascii="Arial" w:hAnsi="Arial" w:cs="Arial"/>
-          <w:sz w:val="16"/>
-          <w:szCs w:val="16"/>
-        </w:rPr>
-        <w:t xml:space="preserve"> of </w:t>
+        <w:t xml:space="preserve">. Classification of </w:t>
       </w:r>
       <w:r>
         <w:rPr>
@@ -1634,25 +1608,7 @@
           <w:szCs w:val="20"/>
           <w:lang w:val="en-GB"/>
         </w:rPr>
-        <w:t xml:space="preserve">defends that moral laws are universal (in that they apply to every human being, everywhere and anytime) and objective (so they are independent from any </w:t>
-      </w:r>
-      <w:proofErr w:type="gramStart"/>
-      <w:r>
-        <w:rPr>
-          <w:sz w:val="22"/>
-          <w:szCs w:val="20"/>
-          <w:lang w:val="en-GB"/>
-        </w:rPr>
-        <w:t>particular consideration</w:t>
-      </w:r>
-      <w:proofErr w:type="gramEnd"/>
-      <w:r>
-        <w:rPr>
-          <w:sz w:val="22"/>
-          <w:szCs w:val="20"/>
-          <w:lang w:val="en-GB"/>
-        </w:rPr>
-        <w:t xml:space="preserve">, </w:t>
+        <w:t xml:space="preserve">defends that moral laws are universal (in that they apply to every human being, everywhere and anytime) and objective (so they are independent from any particular consideration, </w:t>
       </w:r>
       <w:r>
         <w:rPr>
@@ -1740,6 +1696,7 @@
           <w:szCs w:val="20"/>
           <w:lang w:val="en-GB"/>
         </w:rPr>
+        <w:lastRenderedPageBreak/>
         <w:t>Moral objectivism</w:t>
       </w:r>
       <w:r>
@@ -1844,40 +1801,15 @@
           <w:szCs w:val="20"/>
           <w:lang w:val="en-GB"/>
         </w:rPr>
-        <w:t xml:space="preserve">, which leads </w:t>
-      </w:r>
-      <w:r>
-        <w:rPr>
-          <w:sz w:val="22"/>
-          <w:szCs w:val="20"/>
-          <w:lang w:val="en-GB"/>
-        </w:rPr>
-        <w:lastRenderedPageBreak/>
-        <w:t xml:space="preserve">it to apply </w:t>
-      </w:r>
-      <w:r>
-        <w:rPr>
-          <w:sz w:val="22"/>
-          <w:szCs w:val="20"/>
-          <w:lang w:val="en-GB"/>
-        </w:rPr>
-        <w:t xml:space="preserve">a </w:t>
-      </w:r>
-      <w:r>
-        <w:rPr>
-          <w:sz w:val="22"/>
-          <w:szCs w:val="20"/>
-          <w:lang w:val="en-GB"/>
-        </w:rPr>
-        <w:t>hierarchical organization</w:t>
-      </w:r>
-      <w:r>
-        <w:rPr>
-          <w:sz w:val="22"/>
-          <w:szCs w:val="20"/>
-          <w:lang w:val="en-GB"/>
-        </w:rPr>
-        <w:t xml:space="preserve"> to solve these cases</w:t>
+        <w:t xml:space="preserve">, which leads it to apply </w:t>
+      </w:r>
+      <w:r>
+        <w:rPr>
+          <w:sz w:val="22"/>
+          <w:szCs w:val="20"/>
+          <w:lang w:val="en-GB"/>
+        </w:rPr>
+        <w:t>a hierarchical organization to solve these cases</w:t>
       </w:r>
       <w:r>
         <w:rPr>
@@ -2558,6 +2490,7 @@
           <w:szCs w:val="20"/>
           <w:lang w:val="en-GB"/>
         </w:rPr>
+        <w:lastRenderedPageBreak/>
         <w:t xml:space="preserve">a neutral fact, without any intrinsic morality. </w:t>
       </w:r>
       <w:r>
@@ -2626,7 +2559,23 @@
           <w:szCs w:val="20"/>
           <w:lang w:val="en-GB"/>
         </w:rPr>
-        <w:t xml:space="preserve"> is</w:t>
+        <w:t xml:space="preserve"> </w:t>
+      </w:r>
+      <w:r>
+        <w:rPr>
+          <w:sz w:val="22"/>
+          <w:szCs w:val="20"/>
+          <w:lang w:val="en-GB"/>
+        </w:rPr>
+        <w:t xml:space="preserve">acts on the interpretability of a law to lead to different, technically </w:t>
+      </w:r>
+      <w:r>
+        <w:rPr>
+          <w:sz w:val="22"/>
+          <w:szCs w:val="20"/>
+          <w:lang w:val="en-GB"/>
+        </w:rPr>
+        <w:t>correct</w:t>
       </w:r>
     </w:p>
     <w:p>
@@ -2646,7 +2595,6 @@
           <w:szCs w:val="20"/>
           <w:lang w:val="en-GB"/>
         </w:rPr>
-        <w:lastRenderedPageBreak/>
         <w:t>Moral subjectivism</w:t>
       </w:r>
       <w:r>
@@ -2705,6 +2653,550 @@
       <w:pPr>
         <w:pStyle w:val="Narracions"/>
         <w:rPr>
+          <w:sz w:val="22"/>
+          <w:szCs w:val="20"/>
+          <w:lang w:val="en-GB"/>
+        </w:rPr>
+      </w:pPr>
+      <w:r>
+        <w:rPr>
+          <w:sz w:val="22"/>
+          <w:szCs w:val="20"/>
+          <w:lang w:val="en-GB"/>
+        </w:rPr>
+        <w:t xml:space="preserve">In this section, a preliminary plan to develop the model will be </w:t>
+      </w:r>
+      <w:r>
+        <w:rPr>
+          <w:sz w:val="22"/>
+          <w:szCs w:val="20"/>
+          <w:lang w:val="en-GB"/>
+        </w:rPr>
+        <w:t>expande</w:t>
+      </w:r>
+      <w:r>
+        <w:rPr>
+          <w:sz w:val="22"/>
+          <w:szCs w:val="20"/>
+          <w:lang w:val="en-GB"/>
+        </w:rPr>
+        <w:t>d on</w:t>
+      </w:r>
+      <w:r>
+        <w:rPr>
+          <w:sz w:val="22"/>
+          <w:szCs w:val="20"/>
+          <w:lang w:val="en-GB"/>
+        </w:rPr>
+        <w:t>.</w:t>
+      </w:r>
+    </w:p>
+    <w:p>
+      <w:pPr>
+        <w:pStyle w:val="Narracions"/>
+        <w:rPr>
+          <w:sz w:val="22"/>
+          <w:szCs w:val="20"/>
+          <w:lang w:val="en-GB"/>
+        </w:rPr>
+      </w:pPr>
+      <w:r>
+        <w:rPr>
+          <w:sz w:val="22"/>
+          <w:szCs w:val="20"/>
+          <w:lang w:val="en-GB"/>
+        </w:rPr>
+        <w:t xml:space="preserve">Even while avoiding explicitly unique religious stances in </w:t>
+      </w:r>
+      <w:r>
+        <w:rPr>
+          <w:sz w:val="22"/>
+          <w:szCs w:val="20"/>
+          <w:lang w:val="en-GB"/>
+        </w:rPr>
+        <w:t xml:space="preserve">not </w:t>
+      </w:r>
+      <w:r>
+        <w:rPr>
+          <w:sz w:val="22"/>
+          <w:szCs w:val="20"/>
+          <w:lang w:val="en-GB"/>
+        </w:rPr>
+        <w:t>considering</w:t>
+      </w:r>
+      <w:r>
+        <w:rPr>
+          <w:sz w:val="22"/>
+          <w:szCs w:val="20"/>
+          <w:lang w:val="en-GB"/>
+        </w:rPr>
+        <w:t xml:space="preserve"> divine laws, </w:t>
+      </w:r>
+      <w:r>
+        <w:rPr>
+          <w:b/>
+          <w:bCs/>
+          <w:sz w:val="22"/>
+          <w:szCs w:val="20"/>
+          <w:lang w:val="en-GB"/>
+        </w:rPr>
+        <w:t>human-made laws may vary greatly</w:t>
+      </w:r>
+      <w:r>
+        <w:rPr>
+          <w:sz w:val="22"/>
+          <w:szCs w:val="20"/>
+          <w:lang w:val="en-GB"/>
+        </w:rPr>
+        <w:t xml:space="preserve"> </w:t>
+      </w:r>
+      <w:r>
+        <w:rPr>
+          <w:sz w:val="22"/>
+          <w:szCs w:val="20"/>
+          <w:lang w:val="en-GB"/>
+        </w:rPr>
+        <w:t>depending on the time and place one might be</w:t>
+      </w:r>
+      <w:r>
+        <w:rPr>
+          <w:sz w:val="22"/>
+          <w:szCs w:val="20"/>
+          <w:lang w:val="en-GB"/>
+        </w:rPr>
+        <w:t xml:space="preserve"> in</w:t>
+      </w:r>
+      <w:r>
+        <w:rPr>
+          <w:sz w:val="22"/>
+          <w:szCs w:val="20"/>
+          <w:lang w:val="en-GB"/>
+        </w:rPr>
+        <w:t>.</w:t>
+      </w:r>
+      <w:r>
+        <w:rPr>
+          <w:sz w:val="22"/>
+          <w:szCs w:val="20"/>
+          <w:lang w:val="en-GB"/>
+        </w:rPr>
+        <w:t xml:space="preserve"> It is the </w:t>
+      </w:r>
+      <w:r>
+        <w:rPr>
+          <w:sz w:val="22"/>
+          <w:szCs w:val="20"/>
+          <w:lang w:val="en-GB"/>
+        </w:rPr>
+        <w:t xml:space="preserve">aim of this project to provide a schema of beliefs that is </w:t>
+      </w:r>
+      <w:r>
+        <w:rPr>
+          <w:b/>
+          <w:bCs/>
+          <w:sz w:val="22"/>
+          <w:szCs w:val="20"/>
+          <w:lang w:val="en-GB"/>
+        </w:rPr>
+        <w:t>as</w:t>
+      </w:r>
+      <w:r>
+        <w:rPr>
+          <w:sz w:val="22"/>
+          <w:szCs w:val="20"/>
+          <w:lang w:val="en-GB"/>
+        </w:rPr>
+        <w:t xml:space="preserve"> </w:t>
+      </w:r>
+      <w:r>
+        <w:rPr>
+          <w:b/>
+          <w:bCs/>
+          <w:sz w:val="22"/>
+          <w:szCs w:val="20"/>
+          <w:lang w:val="en-GB"/>
+        </w:rPr>
+        <w:t>universal as possible</w:t>
+      </w:r>
+      <w:r>
+        <w:rPr>
+          <w:sz w:val="22"/>
+          <w:szCs w:val="20"/>
+          <w:lang w:val="en-GB"/>
+        </w:rPr>
+        <w:t>, but a very thorough revision would be warranted to make sure any historical o cultural remnant of bias</w:t>
+      </w:r>
+      <w:r>
+        <w:rPr>
+          <w:sz w:val="22"/>
+          <w:szCs w:val="20"/>
+          <w:lang w:val="en-GB"/>
+        </w:rPr>
+        <w:t xml:space="preserve"> from the authors </w:t>
+      </w:r>
+      <w:r>
+        <w:rPr>
+          <w:sz w:val="22"/>
+          <w:szCs w:val="20"/>
+          <w:lang w:val="en-GB"/>
+        </w:rPr>
+        <w:t>is scrubbed out</w:t>
+      </w:r>
+      <w:r>
+        <w:rPr>
+          <w:sz w:val="22"/>
+          <w:szCs w:val="20"/>
+          <w:lang w:val="en-GB"/>
+        </w:rPr>
+        <w:t xml:space="preserve">. The short timeframe allotted to it will not </w:t>
+      </w:r>
+      <w:r>
+        <w:rPr>
+          <w:sz w:val="22"/>
+          <w:szCs w:val="20"/>
+          <w:lang w:val="en-GB"/>
+        </w:rPr>
+        <w:t xml:space="preserve">allow for such </w:t>
+      </w:r>
+      <w:r>
+        <w:rPr>
+          <w:sz w:val="22"/>
+          <w:szCs w:val="20"/>
+          <w:lang w:val="en-GB"/>
+        </w:rPr>
+        <w:t xml:space="preserve">revision, so this shall be considered a very broad, possibly skewed, </w:t>
+      </w:r>
+      <w:r>
+        <w:rPr>
+          <w:sz w:val="22"/>
+          <w:szCs w:val="20"/>
+          <w:lang w:val="en-GB"/>
+        </w:rPr>
+        <w:t>expression of the ultimate objective of this project.</w:t>
+      </w:r>
+    </w:p>
+    <w:p>
+      <w:pPr>
+        <w:pStyle w:val="Narracions"/>
+        <w:rPr>
+          <w:sz w:val="22"/>
+          <w:szCs w:val="20"/>
+          <w:lang w:val="en-GB"/>
+        </w:rPr>
+      </w:pPr>
+      <w:r>
+        <w:rPr>
+          <w:sz w:val="22"/>
+          <w:szCs w:val="20"/>
+          <w:lang w:val="en-GB"/>
+        </w:rPr>
+        <w:t xml:space="preserve">All three categories of laws, according to their </w:t>
+      </w:r>
+      <w:r>
+        <w:rPr>
+          <w:b/>
+          <w:bCs/>
+          <w:sz w:val="22"/>
+          <w:szCs w:val="20"/>
+          <w:lang w:val="en-GB"/>
+        </w:rPr>
+        <w:t>scope</w:t>
+      </w:r>
+      <w:r>
+        <w:rPr>
+          <w:sz w:val="22"/>
+          <w:szCs w:val="20"/>
+          <w:lang w:val="en-GB"/>
+        </w:rPr>
+        <w:t xml:space="preserve">, should be considered. </w:t>
+      </w:r>
+      <w:r>
+        <w:rPr>
+          <w:b/>
+          <w:bCs/>
+          <w:sz w:val="22"/>
+          <w:szCs w:val="20"/>
+          <w:lang w:val="en-GB"/>
+        </w:rPr>
+        <w:t>Natural laws</w:t>
+      </w:r>
+      <w:r>
+        <w:rPr>
+          <w:sz w:val="22"/>
+          <w:szCs w:val="20"/>
+          <w:lang w:val="en-GB"/>
+        </w:rPr>
+        <w:t xml:space="preserve"> </w:t>
+      </w:r>
+      <w:r>
+        <w:rPr>
+          <w:sz w:val="22"/>
+          <w:szCs w:val="20"/>
+          <w:lang w:val="en-GB"/>
+        </w:rPr>
+        <w:t xml:space="preserve">are </w:t>
+      </w:r>
+      <w:r>
+        <w:rPr>
+          <w:sz w:val="22"/>
+          <w:szCs w:val="20"/>
+          <w:lang w:val="en-GB"/>
+        </w:rPr>
+        <w:t xml:space="preserve">to be assumed, as the </w:t>
+      </w:r>
+      <w:r>
+        <w:rPr>
+          <w:sz w:val="22"/>
+          <w:szCs w:val="20"/>
+          <w:lang w:val="en-GB"/>
+        </w:rPr>
+        <w:t>relevance</w:t>
+      </w:r>
+      <w:r>
+        <w:rPr>
+          <w:sz w:val="22"/>
+          <w:szCs w:val="20"/>
+          <w:lang w:val="en-GB"/>
+        </w:rPr>
+        <w:t xml:space="preserve"> of the </w:t>
+      </w:r>
+      <w:r>
+        <w:rPr>
+          <w:sz w:val="22"/>
+          <w:szCs w:val="20"/>
+          <w:lang w:val="en-GB"/>
+        </w:rPr>
+        <w:t>solutions provided by the model hinge on them being executable in the world.</w:t>
+      </w:r>
+      <w:r>
+        <w:rPr>
+          <w:sz w:val="22"/>
+          <w:szCs w:val="20"/>
+          <w:lang w:val="en-GB"/>
+        </w:rPr>
+        <w:t xml:space="preserve"> Ethics is a field of study </w:t>
+      </w:r>
+      <w:r>
+        <w:rPr>
+          <w:sz w:val="22"/>
+          <w:szCs w:val="20"/>
+          <w:lang w:val="en-GB"/>
+        </w:rPr>
+        <w:t>prominently focused on its practical application, rather than theoretical elucubration</w:t>
+      </w:r>
+      <w:r>
+        <w:rPr>
+          <w:sz w:val="22"/>
+          <w:szCs w:val="20"/>
+          <w:lang w:val="en-GB"/>
+        </w:rPr>
+        <w:t>. The quotidian focus of the present project reinforces this direction.</w:t>
+      </w:r>
+      <w:r>
+        <w:rPr>
+          <w:sz w:val="22"/>
+          <w:szCs w:val="20"/>
+          <w:lang w:val="en-GB"/>
+        </w:rPr>
+        <w:t xml:space="preserve"> </w:t>
+      </w:r>
+      <w:r>
+        <w:rPr>
+          <w:b/>
+          <w:bCs/>
+          <w:sz w:val="22"/>
+          <w:szCs w:val="20"/>
+          <w:lang w:val="en-GB"/>
+        </w:rPr>
+        <w:t>Positive laws</w:t>
+      </w:r>
+      <w:r>
+        <w:rPr>
+          <w:sz w:val="22"/>
+          <w:szCs w:val="20"/>
+          <w:lang w:val="en-GB"/>
+        </w:rPr>
+        <w:t xml:space="preserve"> are to be enforced. It is unknown what use might the imagined model have in the long run, but </w:t>
+      </w:r>
+      <w:r>
+        <w:rPr>
+          <w:sz w:val="22"/>
+          <w:szCs w:val="20"/>
+          <w:lang w:val="en-GB"/>
+        </w:rPr>
+        <w:t xml:space="preserve">it is unlikely that it would be </w:t>
+      </w:r>
+      <w:r>
+        <w:rPr>
+          <w:sz w:val="22"/>
+          <w:szCs w:val="20"/>
+          <w:lang w:val="en-GB"/>
+        </w:rPr>
+        <w:t xml:space="preserve">beneficial </w:t>
+      </w:r>
+      <w:r>
+        <w:rPr>
+          <w:sz w:val="22"/>
+          <w:szCs w:val="20"/>
+          <w:lang w:val="en-GB"/>
+        </w:rPr>
+        <w:t xml:space="preserve">that it </w:t>
+      </w:r>
+      <w:r>
+        <w:rPr>
+          <w:sz w:val="22"/>
+          <w:szCs w:val="20"/>
+          <w:lang w:val="en-GB"/>
+        </w:rPr>
+        <w:t>c</w:t>
+      </w:r>
+      <w:r>
+        <w:rPr>
+          <w:sz w:val="22"/>
+          <w:szCs w:val="20"/>
+          <w:lang w:val="en-GB"/>
+        </w:rPr>
+        <w:t xml:space="preserve">ould be prone or even allowed to offer solutions that </w:t>
+      </w:r>
+      <w:r>
+        <w:rPr>
+          <w:sz w:val="22"/>
+          <w:szCs w:val="20"/>
+          <w:lang w:val="en-GB"/>
+        </w:rPr>
+        <w:t>could lead to the user breaking the law to accommodate them.</w:t>
+      </w:r>
+      <w:r>
+        <w:rPr>
+          <w:sz w:val="22"/>
+          <w:szCs w:val="20"/>
+          <w:lang w:val="en-GB"/>
+        </w:rPr>
+        <w:t xml:space="preserve"> Of course, </w:t>
+      </w:r>
+      <w:r>
+        <w:rPr>
+          <w:b/>
+          <w:bCs/>
+          <w:sz w:val="22"/>
+          <w:szCs w:val="20"/>
+          <w:lang w:val="en-GB"/>
+        </w:rPr>
+        <w:t>moral objectivism</w:t>
+      </w:r>
+      <w:r>
+        <w:rPr>
+          <w:sz w:val="22"/>
+          <w:szCs w:val="20"/>
+          <w:lang w:val="en-GB"/>
+        </w:rPr>
+        <w:t xml:space="preserve"> might allow for it as a last resort, but </w:t>
+      </w:r>
+      <w:r>
+        <w:rPr>
+          <w:sz w:val="22"/>
+          <w:szCs w:val="20"/>
+          <w:lang w:val="en-GB"/>
+        </w:rPr>
+        <w:t>this kind of judgement should not be made by the model, rather the user that would receive the best possible solution without resorting to such extremes.</w:t>
+      </w:r>
+      <w:r>
+        <w:rPr>
+          <w:sz w:val="22"/>
+          <w:szCs w:val="20"/>
+          <w:lang w:val="en-GB"/>
+        </w:rPr>
+        <w:t xml:space="preserve"> Liability is a difficult topic in the field of Artificial Intelligence.</w:t>
+      </w:r>
+      <w:r>
+        <w:rPr>
+          <w:sz w:val="22"/>
+          <w:szCs w:val="20"/>
+          <w:lang w:val="en-GB"/>
+        </w:rPr>
+        <w:t xml:space="preserve"> Finally, </w:t>
+      </w:r>
+      <w:r>
+        <w:rPr>
+          <w:b/>
+          <w:bCs/>
+          <w:sz w:val="22"/>
+          <w:szCs w:val="20"/>
+          <w:lang w:val="en-GB"/>
+        </w:rPr>
+        <w:t>m</w:t>
+      </w:r>
+      <w:r>
+        <w:rPr>
+          <w:b/>
+          <w:bCs/>
+          <w:sz w:val="22"/>
+          <w:szCs w:val="20"/>
+          <w:lang w:val="en-GB"/>
+        </w:rPr>
+        <w:t>oral laws</w:t>
+      </w:r>
+      <w:r>
+        <w:rPr>
+          <w:sz w:val="22"/>
+          <w:szCs w:val="20"/>
+          <w:lang w:val="en-GB"/>
+        </w:rPr>
+        <w:t xml:space="preserve"> are a given, considering the </w:t>
+      </w:r>
+      <w:r>
+        <w:rPr>
+          <w:sz w:val="22"/>
+          <w:szCs w:val="20"/>
+          <w:lang w:val="en-GB"/>
+        </w:rPr>
+        <w:t>objective of th</w:t>
+      </w:r>
+      <w:r>
+        <w:rPr>
+          <w:sz w:val="22"/>
+          <w:szCs w:val="20"/>
+          <w:lang w:val="en-GB"/>
+        </w:rPr>
+        <w:t>e</w:t>
+      </w:r>
+      <w:r>
+        <w:rPr>
+          <w:sz w:val="22"/>
+          <w:szCs w:val="20"/>
+          <w:lang w:val="en-GB"/>
+        </w:rPr>
+        <w:t xml:space="preserve"> project</w:t>
+      </w:r>
+      <w:r>
+        <w:rPr>
+          <w:sz w:val="22"/>
+          <w:szCs w:val="20"/>
+          <w:lang w:val="en-GB"/>
+        </w:rPr>
+        <w:t xml:space="preserve"> to train </w:t>
+      </w:r>
+      <w:r>
+        <w:rPr>
+          <w:sz w:val="22"/>
+          <w:szCs w:val="20"/>
+          <w:lang w:val="en-GB"/>
+        </w:rPr>
+        <w:t xml:space="preserve">a </w:t>
+      </w:r>
+      <w:r>
+        <w:rPr>
+          <w:sz w:val="22"/>
+          <w:szCs w:val="20"/>
+          <w:lang w:val="en-GB"/>
+        </w:rPr>
+        <w:t>model to provide solutions for quotidian moral dilemmas.</w:t>
+      </w:r>
+    </w:p>
+    <w:p>
+      <w:pPr>
+        <w:pStyle w:val="Narracions"/>
+        <w:rPr>
           <w:i/>
           <w:iCs/>
           <w:sz w:val="22"/>
@@ -2720,7 +3212,7 @@
           <w:szCs w:val="20"/>
           <w:lang w:val="en-GB"/>
         </w:rPr>
-        <w:t xml:space="preserve">Religious underpinnings or fully secular </w:t>
+        <w:t xml:space="preserve">Is it relevant that a </w:t>
       </w:r>
       <w:r>
         <w:rPr>
@@ -2730,17 +3222,7 @@
           <w:szCs w:val="20"/>
           <w:lang w:val="en-GB"/>
         </w:rPr>
-        <w:t xml:space="preserve">(notwithstanding historical remnants) </w:t>
-      </w:r>
-      <w:r>
-        <w:rPr>
-          <w:i/>
-          <w:iCs/>
-          <w:sz w:val="22"/>
-          <w:szCs w:val="20"/>
-          <w:lang w:val="en-GB"/>
-        </w:rPr>
-        <w:t>schema of beliefs?</w:t>
+        <w:t>law may be imperative in the model’s training?</w:t>
       </w:r>
     </w:p>
     <w:p>
@@ -2758,19 +3240,128 @@
       </w:pPr>
       <w:r>
         <w:rPr>
-          <w:sz w:val="22"/>
-          <w:szCs w:val="20"/>
-          <w:lang w:val="en-GB"/>
-        </w:rPr>
-        <w:t xml:space="preserve">Make it as universal as possible. Avoid explicitly unique </w:t>
-      </w:r>
-      <w:r>
-        <w:rPr>
-          <w:sz w:val="22"/>
-          <w:szCs w:val="20"/>
-          <w:lang w:val="en-GB"/>
-        </w:rPr>
-        <w:t>religious stances and focus on the most broadly accepted ethos.</w:t>
+          <w:b/>
+          <w:bCs/>
+          <w:sz w:val="22"/>
+          <w:szCs w:val="20"/>
+          <w:lang w:val="en-GB"/>
+        </w:rPr>
+        <w:t>Yes</w:t>
+      </w:r>
+      <w:r>
+        <w:rPr>
+          <w:sz w:val="22"/>
+          <w:szCs w:val="20"/>
+          <w:lang w:val="en-GB"/>
+        </w:rPr>
+        <w:t xml:space="preserve">. It may be possible to train the model so that it shows a modicum of nuance in evaluating </w:t>
+      </w:r>
+      <w:r>
+        <w:rPr>
+          <w:sz w:val="22"/>
+          <w:szCs w:val="20"/>
+          <w:lang w:val="en-GB"/>
+        </w:rPr>
+        <w:t>whether</w:t>
+      </w:r>
+      <w:r>
+        <w:rPr>
+          <w:sz w:val="22"/>
+          <w:szCs w:val="20"/>
+          <w:lang w:val="en-GB"/>
+        </w:rPr>
+        <w:t xml:space="preserve"> to </w:t>
+      </w:r>
+      <w:r>
+        <w:rPr>
+          <w:b/>
+          <w:bCs/>
+          <w:sz w:val="22"/>
+          <w:szCs w:val="20"/>
+          <w:lang w:val="en-GB"/>
+        </w:rPr>
+        <w:t>break an imperative law</w:t>
+      </w:r>
+      <w:r>
+        <w:rPr>
+          <w:sz w:val="22"/>
+          <w:szCs w:val="20"/>
+          <w:lang w:val="en-GB"/>
+        </w:rPr>
+        <w:t xml:space="preserve">. </w:t>
+      </w:r>
+      <w:r>
+        <w:rPr>
+          <w:sz w:val="22"/>
+          <w:szCs w:val="20"/>
+          <w:lang w:val="en-GB"/>
+        </w:rPr>
+        <w:t xml:space="preserve">As previously stated, </w:t>
+      </w:r>
+      <w:r>
+        <w:rPr>
+          <w:sz w:val="22"/>
+          <w:szCs w:val="20"/>
+          <w:lang w:val="en-GB"/>
+        </w:rPr>
+        <w:t xml:space="preserve">the model should not incentivise breaking a positive law, but it might be asked to </w:t>
+      </w:r>
+      <w:r>
+        <w:rPr>
+          <w:b/>
+          <w:bCs/>
+          <w:sz w:val="22"/>
+          <w:szCs w:val="20"/>
+          <w:lang w:val="en-GB"/>
+        </w:rPr>
+        <w:t>prioritise a moral law</w:t>
+      </w:r>
+      <w:r>
+        <w:rPr>
+          <w:sz w:val="22"/>
+          <w:szCs w:val="20"/>
+          <w:lang w:val="en-GB"/>
+        </w:rPr>
+        <w:t xml:space="preserve"> above another, thus breaking or overlooking the </w:t>
+      </w:r>
+      <w:r>
+        <w:rPr>
+          <w:sz w:val="22"/>
+          <w:szCs w:val="20"/>
+          <w:lang w:val="en-GB"/>
+        </w:rPr>
+        <w:t xml:space="preserve">one that </w:t>
+      </w:r>
+      <w:r>
+        <w:rPr>
+          <w:sz w:val="22"/>
+          <w:szCs w:val="20"/>
+          <w:lang w:val="en-GB"/>
+        </w:rPr>
+        <w:lastRenderedPageBreak/>
+        <w:t>it deems less relevant. Conflicts such as this one can happen, for example, in moral objectivism.</w:t>
+      </w:r>
+    </w:p>
+    <w:p>
+      <w:pPr>
+        <w:pStyle w:val="Narracions"/>
+        <w:rPr>
+          <w:i/>
+          <w:iCs/>
+          <w:sz w:val="22"/>
+          <w:szCs w:val="20"/>
+          <w:lang w:val="en-GB"/>
+        </w:rPr>
+      </w:pPr>
+      <w:r>
+        <w:rPr>
+          <w:i/>
+          <w:iCs/>
+          <w:sz w:val="22"/>
+          <w:szCs w:val="20"/>
+          <w:lang w:val="en-GB"/>
+        </w:rPr>
+        <w:t>Are all external sanctions relevant?</w:t>
       </w:r>
     </w:p>
     <w:p>
@@ -2788,51 +3379,79 @@
       </w:pPr>
       <w:r>
         <w:rPr>
-          <w:sz w:val="22"/>
-          <w:szCs w:val="20"/>
-          <w:lang w:val="en-GB"/>
-        </w:rPr>
-        <w:t xml:space="preserve">This means </w:t>
-      </w:r>
-      <w:r>
-        <w:rPr>
           <w:b/>
           <w:bCs/>
           <w:sz w:val="22"/>
           <w:szCs w:val="20"/>
           <w:lang w:val="en-GB"/>
         </w:rPr>
-        <w:t>human laws</w:t>
-      </w:r>
-      <w:r>
-        <w:rPr>
-          <w:sz w:val="22"/>
-          <w:szCs w:val="20"/>
-          <w:lang w:val="en-GB"/>
-        </w:rPr>
-        <w:t>.</w:t>
-      </w:r>
-    </w:p>
-    <w:p>
-      <w:pPr>
-        <w:pStyle w:val="Narracions"/>
-        <w:rPr>
-          <w:i/>
-          <w:iCs/>
-          <w:sz w:val="22"/>
-          <w:szCs w:val="20"/>
-          <w:lang w:val="en-GB"/>
-        </w:rPr>
-      </w:pPr>
-      <w:r>
-        <w:rPr>
-          <w:i/>
-          <w:iCs/>
-          <w:sz w:val="22"/>
-          <w:szCs w:val="20"/>
-          <w:lang w:val="en-GB"/>
-        </w:rPr>
-        <w:t>Scope of the laws?</w:t>
+        <w:t>Yes</w:t>
+      </w:r>
+      <w:r>
+        <w:rPr>
+          <w:sz w:val="22"/>
+          <w:szCs w:val="20"/>
+          <w:lang w:val="en-GB"/>
+        </w:rPr>
+        <w:t xml:space="preserve">. </w:t>
+      </w:r>
+      <w:r>
+        <w:rPr>
+          <w:b/>
+          <w:bCs/>
+          <w:sz w:val="22"/>
+          <w:szCs w:val="20"/>
+          <w:lang w:val="en-GB"/>
+        </w:rPr>
+        <w:t>Natural sanctions</w:t>
+      </w:r>
+      <w:r>
+        <w:rPr>
+          <w:sz w:val="22"/>
+          <w:szCs w:val="20"/>
+          <w:lang w:val="en-GB"/>
+        </w:rPr>
+        <w:t xml:space="preserve"> are, as with natural laws, to be assumed. </w:t>
+      </w:r>
+      <w:r>
+        <w:rPr>
+          <w:sz w:val="22"/>
+          <w:szCs w:val="20"/>
+          <w:lang w:val="en-GB"/>
+        </w:rPr>
+        <w:t xml:space="preserve">Those consequences are axiomatic and </w:t>
+      </w:r>
+      <w:r>
+        <w:rPr>
+          <w:sz w:val="22"/>
+          <w:szCs w:val="20"/>
+          <w:lang w:val="en-GB"/>
+        </w:rPr>
+        <w:t>ought to</w:t>
+      </w:r>
+      <w:r>
+        <w:rPr>
+          <w:sz w:val="22"/>
+          <w:szCs w:val="20"/>
+          <w:lang w:val="en-GB"/>
+        </w:rPr>
+        <w:t xml:space="preserve"> never be overlooked when providing a solution to a dilemma, as </w:t>
+      </w:r>
+      <w:r>
+        <w:rPr>
+          <w:sz w:val="22"/>
+          <w:szCs w:val="20"/>
+          <w:lang w:val="en-GB"/>
+        </w:rPr>
+        <w:t xml:space="preserve">physical safety could be hindered, both the individual’s (moral agent) or </w:t>
+      </w:r>
+      <w:r>
+        <w:rPr>
+          <w:sz w:val="22"/>
+          <w:szCs w:val="20"/>
+          <w:lang w:val="en-GB"/>
+        </w:rPr>
+        <w:t>anyone else involved.</w:t>
       </w:r>
     </w:p>
     <w:p>
@@ -2856,71 +3475,47 @@
           <w:szCs w:val="20"/>
           <w:lang w:val="en-GB"/>
         </w:rPr>
-        <w:t>Natural laws</w:t>
-      </w:r>
-      <w:r>
-        <w:rPr>
-          <w:sz w:val="22"/>
-          <w:szCs w:val="20"/>
-          <w:lang w:val="en-GB"/>
-        </w:rPr>
-        <w:t xml:space="preserve"> are </w:t>
-      </w:r>
-      <w:r>
-        <w:rPr>
-          <w:sz w:val="22"/>
-          <w:szCs w:val="20"/>
-          <w:lang w:val="en-GB"/>
-        </w:rPr>
-        <w:t xml:space="preserve">to be assumed, as the </w:t>
-      </w:r>
-      <w:r>
-        <w:rPr>
-          <w:sz w:val="22"/>
-          <w:szCs w:val="20"/>
-          <w:lang w:val="en-GB"/>
-        </w:rPr>
-        <w:t>relevance</w:t>
-      </w:r>
-      <w:r>
-        <w:rPr>
-          <w:sz w:val="22"/>
-          <w:szCs w:val="20"/>
-          <w:lang w:val="en-GB"/>
-        </w:rPr>
-        <w:t xml:space="preserve"> of the </w:t>
-      </w:r>
-      <w:r>
-        <w:rPr>
-          <w:sz w:val="22"/>
-          <w:szCs w:val="20"/>
-          <w:lang w:val="en-GB"/>
-        </w:rPr>
-        <w:t>solutions provided by the model hinge on them being executable in the world.</w:t>
-      </w:r>
-      <w:r>
-        <w:rPr>
-          <w:sz w:val="22"/>
-          <w:szCs w:val="20"/>
-          <w:lang w:val="en-GB"/>
-        </w:rPr>
-        <w:t xml:space="preserve"> Ethics is a field of study </w:t>
-      </w:r>
-      <w:r>
-        <w:rPr>
-          <w:sz w:val="22"/>
-          <w:szCs w:val="20"/>
-          <w:lang w:val="en-GB"/>
-        </w:rPr>
-        <w:t>prominently focused on its practical application, rather than theoretical elucubration</w:t>
-      </w:r>
-      <w:r>
-        <w:rPr>
-          <w:sz w:val="22"/>
-          <w:szCs w:val="20"/>
-          <w:lang w:val="en-GB"/>
-        </w:rPr>
-        <w:t>. The quotidian focus of the present project reinforces this direction.</w:t>
+        <w:t>Legal sanctions</w:t>
+      </w:r>
+      <w:r>
+        <w:rPr>
+          <w:sz w:val="22"/>
+          <w:szCs w:val="20"/>
+          <w:lang w:val="en-GB"/>
+        </w:rPr>
+        <w:t xml:space="preserve"> are the reason why </w:t>
+      </w:r>
+      <w:r>
+        <w:rPr>
+          <w:sz w:val="22"/>
+          <w:szCs w:val="20"/>
+          <w:lang w:val="en-GB"/>
+        </w:rPr>
+        <w:t xml:space="preserve">positive laws should not be broken nor </w:t>
+      </w:r>
+      <w:r>
+        <w:rPr>
+          <w:sz w:val="22"/>
+          <w:szCs w:val="20"/>
+          <w:lang w:val="en-GB"/>
+        </w:rPr>
+        <w:t xml:space="preserve">should illegal </w:t>
+      </w:r>
+      <w:r>
+        <w:rPr>
+          <w:sz w:val="22"/>
+          <w:szCs w:val="20"/>
+          <w:lang w:val="en-GB"/>
+        </w:rPr>
+        <w:t xml:space="preserve">actions be incentivised. They must be considered before providing the final </w:t>
+      </w:r>
+      <w:r>
+        <w:rPr>
+          <w:sz w:val="22"/>
+          <w:szCs w:val="20"/>
+          <w:lang w:val="en-GB"/>
+        </w:rPr>
+        <w:t>solution to the dilemma.</w:t>
       </w:r>
     </w:p>
     <w:p>
@@ -2944,47 +3539,81 @@
           <w:szCs w:val="20"/>
           <w:lang w:val="en-GB"/>
         </w:rPr>
-        <w:t>Positive laws</w:t>
-      </w:r>
-      <w:r>
-        <w:rPr>
-          <w:sz w:val="22"/>
-          <w:szCs w:val="20"/>
-          <w:lang w:val="en-GB"/>
-        </w:rPr>
-        <w:t xml:space="preserve"> are to be enforced. It is unknown what use might the imagined model have in the long run, but </w:t>
-      </w:r>
-      <w:r>
-        <w:rPr>
-          <w:sz w:val="22"/>
-          <w:szCs w:val="20"/>
-          <w:lang w:val="en-GB"/>
-        </w:rPr>
-        <w:t xml:space="preserve">it is unlikely that it would be </w:t>
-      </w:r>
-      <w:r>
-        <w:rPr>
-          <w:sz w:val="22"/>
-          <w:szCs w:val="20"/>
-          <w:lang w:val="en-GB"/>
-        </w:rPr>
-        <w:t xml:space="preserve">beneficial </w:t>
-      </w:r>
-      <w:r>
-        <w:rPr>
-          <w:sz w:val="22"/>
-          <w:szCs w:val="20"/>
-          <w:lang w:val="en-GB"/>
-        </w:rPr>
-        <w:t xml:space="preserve">that it would be prone or even allowed to offer solutions that </w:t>
-      </w:r>
-      <w:r>
-        <w:rPr>
-          <w:sz w:val="22"/>
-          <w:szCs w:val="20"/>
-          <w:lang w:val="en-GB"/>
-        </w:rPr>
-        <w:t>could lead to the user breaking the law to accommodate them.</w:t>
+        <w:t>Social sanctions</w:t>
+      </w:r>
+      <w:r>
+        <w:rPr>
+          <w:sz w:val="22"/>
+          <w:szCs w:val="20"/>
+          <w:lang w:val="en-GB"/>
+        </w:rPr>
+        <w:t xml:space="preserve"> are important both to pre</w:t>
+      </w:r>
+      <w:r>
+        <w:rPr>
+          <w:sz w:val="22"/>
+          <w:szCs w:val="20"/>
+          <w:lang w:val="en-GB"/>
+        </w:rPr>
+        <w:t xml:space="preserve">vent social unrest within the community the user will likely be a part of and considering </w:t>
+      </w:r>
+      <w:r>
+        <w:rPr>
+          <w:sz w:val="22"/>
+          <w:szCs w:val="20"/>
+          <w:lang w:val="en-GB"/>
+        </w:rPr>
+        <w:t xml:space="preserve">the dilemmas will be quotidian </w:t>
+      </w:r>
+      <w:r>
+        <w:rPr>
+          <w:sz w:val="22"/>
+          <w:szCs w:val="20"/>
+          <w:lang w:val="en-GB"/>
+        </w:rPr>
+        <w:t>scenes a person might encounter and solve organically.</w:t>
+      </w:r>
+    </w:p>
+    <w:p>
+      <w:pPr>
+        <w:pStyle w:val="Narracions"/>
+        <w:rPr>
+          <w:i/>
+          <w:iCs/>
+          <w:sz w:val="22"/>
+          <w:szCs w:val="20"/>
+          <w:lang w:val="en-GB"/>
+        </w:rPr>
+      </w:pPr>
+      <w:r>
+        <w:rPr>
+          <w:i/>
+          <w:iCs/>
+          <w:sz w:val="22"/>
+          <w:szCs w:val="20"/>
+          <w:lang w:val="en-GB"/>
+        </w:rPr>
+        <w:t>What schools of thought ar</w:t>
+      </w:r>
+      <w:r>
+        <w:rPr>
+          <w:i/>
+          <w:iCs/>
+          <w:sz w:val="22"/>
+          <w:szCs w:val="20"/>
+          <w:lang w:val="en-GB"/>
+        </w:rPr>
+        <w:t xml:space="preserve">e most </w:t>
+      </w:r>
+      <w:r>
+        <w:rPr>
+          <w:i/>
+          <w:iCs/>
+          <w:sz w:val="22"/>
+          <w:szCs w:val="20"/>
+          <w:lang w:val="en-GB"/>
+        </w:rPr>
+        <w:t>promising?</w:t>
       </w:r>
     </w:p>
     <w:p>
@@ -3002,37 +3631,37 @@
       </w:pPr>
       <w:r>
         <w:rPr>
-          <w:b/>
-          <w:bCs/>
-          <w:sz w:val="22"/>
-          <w:szCs w:val="20"/>
-          <w:lang w:val="en-GB"/>
-        </w:rPr>
-        <w:t>Moral laws</w:t>
-      </w:r>
-      <w:r>
-        <w:rPr>
-          <w:sz w:val="22"/>
-          <w:szCs w:val="20"/>
-          <w:lang w:val="en-GB"/>
-        </w:rPr>
-        <w:t xml:space="preserve"> are a given, considering the </w:t>
-      </w:r>
-      <w:r>
-        <w:rPr>
-          <w:sz w:val="22"/>
-          <w:szCs w:val="20"/>
-          <w:lang w:val="en-GB"/>
-        </w:rPr>
-        <w:t>objective of this project.</w:t>
+          <w:sz w:val="22"/>
+          <w:szCs w:val="20"/>
+          <w:lang w:val="en-GB"/>
+        </w:rPr>
+        <w:t xml:space="preserve">Moral objectivism and its ten </w:t>
+      </w:r>
+      <w:r>
+        <w:rPr>
+          <w:sz w:val="22"/>
+          <w:szCs w:val="20"/>
+          <w:lang w:val="en-GB"/>
+        </w:rPr>
+        <w:t>laws</w:t>
+      </w:r>
+      <w:r>
+        <w:rPr>
+          <w:sz w:val="22"/>
+          <w:szCs w:val="20"/>
+          <w:lang w:val="en-GB"/>
+        </w:rPr>
+        <w:t>, without the tenth.</w:t>
       </w:r>
     </w:p>
     <w:p>
       <w:pPr>
         <w:pStyle w:val="Narracions"/>
-        <w:rPr>
-          <w:i/>
-          <w:iCs/>
+        <w:numPr>
+          <w:ilvl w:val="1"/>
+          <w:numId w:val="1"/>
+        </w:numPr>
+        <w:rPr>
           <w:sz w:val="22"/>
           <w:szCs w:val="20"/>
           <w:lang w:val="en-GB"/>
@@ -3040,23 +3669,11 @@
       </w:pPr>
       <w:r>
         <w:rPr>
-          <w:i/>
-          <w:iCs/>
-          <w:sz w:val="22"/>
-          <w:szCs w:val="20"/>
-          <w:lang w:val="en-GB"/>
-        </w:rPr>
-        <w:t xml:space="preserve">Is it relevant that a </w:t>
-      </w:r>
-      <w:r>
-        <w:rPr>
-          <w:i/>
-          <w:iCs/>
-          <w:sz w:val="22"/>
-          <w:szCs w:val="20"/>
-          <w:lang w:val="en-GB"/>
-        </w:rPr>
-        <w:t>law may be imperative in the model’s training?</w:t>
+          <w:sz w:val="22"/>
+          <w:szCs w:val="20"/>
+          <w:lang w:val="en-GB"/>
+        </w:rPr>
+        <w:t>In AI, is this not the same as in absolutism? In that the rule is to follow until it cannot be followed, without ever breaking the tenth?</w:t>
       </w:r>
     </w:p>
     <w:p>
@@ -3074,402 +3691,19 @@
       </w:pPr>
       <w:r>
         <w:rPr>
-          <w:b/>
-          <w:bCs/>
-          <w:sz w:val="22"/>
-          <w:szCs w:val="20"/>
-          <w:lang w:val="en-GB"/>
-        </w:rPr>
-        <w:t>Yes</w:t>
-      </w:r>
-      <w:r>
-        <w:rPr>
-          <w:sz w:val="22"/>
-          <w:szCs w:val="20"/>
-          <w:lang w:val="en-GB"/>
-        </w:rPr>
-        <w:t xml:space="preserve">. It may be possible to train the model so that it shows a modicum of nuance in evaluating </w:t>
-      </w:r>
-      <w:r>
-        <w:rPr>
-          <w:sz w:val="22"/>
-          <w:szCs w:val="20"/>
-          <w:lang w:val="en-GB"/>
-        </w:rPr>
-        <w:t>whether</w:t>
-      </w:r>
-      <w:r>
-        <w:rPr>
-          <w:sz w:val="22"/>
-          <w:szCs w:val="20"/>
-          <w:lang w:val="en-GB"/>
-        </w:rPr>
-        <w:t xml:space="preserve"> to </w:t>
-      </w:r>
-      <w:r>
-        <w:rPr>
-          <w:b/>
-          <w:bCs/>
-          <w:sz w:val="22"/>
-          <w:szCs w:val="20"/>
-          <w:lang w:val="en-GB"/>
-        </w:rPr>
-        <w:t>break an imperative law</w:t>
-      </w:r>
-      <w:r>
-        <w:rPr>
-          <w:sz w:val="22"/>
-          <w:szCs w:val="20"/>
-          <w:lang w:val="en-GB"/>
-        </w:rPr>
-        <w:t xml:space="preserve">. </w:t>
-      </w:r>
-      <w:r>
-        <w:rPr>
-          <w:sz w:val="22"/>
-          <w:szCs w:val="20"/>
-          <w:lang w:val="en-GB"/>
-        </w:rPr>
-        <w:t xml:space="preserve">As previously stated, </w:t>
-      </w:r>
-      <w:r>
-        <w:rPr>
-          <w:sz w:val="22"/>
-          <w:szCs w:val="20"/>
-          <w:lang w:val="en-GB"/>
-        </w:rPr>
-        <w:t xml:space="preserve">the model should not incentivise breaking a positive law, but it might be asked to </w:t>
-      </w:r>
-      <w:r>
-        <w:rPr>
-          <w:b/>
-          <w:bCs/>
-          <w:sz w:val="22"/>
-          <w:szCs w:val="20"/>
-          <w:lang w:val="en-GB"/>
-        </w:rPr>
-        <w:t>prioritise a moral law</w:t>
-      </w:r>
-      <w:r>
-        <w:rPr>
-          <w:sz w:val="22"/>
-          <w:szCs w:val="20"/>
-          <w:lang w:val="en-GB"/>
-        </w:rPr>
-        <w:t xml:space="preserve"> above another, thus breaking or overlooking the </w:t>
-      </w:r>
-      <w:r>
-        <w:rPr>
-          <w:sz w:val="22"/>
-          <w:szCs w:val="20"/>
-          <w:lang w:val="en-GB"/>
-        </w:rPr>
-        <w:t>one that it deems less relevant. Conflicts such as this one can happen, for example, in moral objectivism.</w:t>
-      </w:r>
-    </w:p>
-    <w:p>
-      <w:pPr>
-        <w:pStyle w:val="Narracions"/>
-        <w:rPr>
-          <w:i/>
-          <w:iCs/>
-          <w:sz w:val="22"/>
-          <w:szCs w:val="20"/>
-          <w:lang w:val="en-GB"/>
-        </w:rPr>
-      </w:pPr>
-      <w:r>
-        <w:rPr>
-          <w:i/>
-          <w:iCs/>
-          <w:sz w:val="22"/>
-          <w:szCs w:val="20"/>
-          <w:lang w:val="en-GB"/>
-        </w:rPr>
-        <w:t>Are all external sanctions relevant?</w:t>
-      </w:r>
-    </w:p>
-    <w:p>
-      <w:pPr>
-        <w:pStyle w:val="Narracions"/>
-        <w:numPr>
-          <w:ilvl w:val="0"/>
-          <w:numId w:val="1"/>
-        </w:numPr>
-        <w:rPr>
-          <w:sz w:val="22"/>
-          <w:szCs w:val="20"/>
-          <w:lang w:val="en-GB"/>
-        </w:rPr>
-      </w:pPr>
-      <w:r>
-        <w:rPr>
-          <w:b/>
-          <w:bCs/>
-          <w:sz w:val="22"/>
-          <w:szCs w:val="20"/>
-          <w:lang w:val="en-GB"/>
-        </w:rPr>
-        <w:t>Yes</w:t>
-      </w:r>
-      <w:r>
-        <w:rPr>
-          <w:sz w:val="22"/>
-          <w:szCs w:val="20"/>
-          <w:lang w:val="en-GB"/>
-        </w:rPr>
-        <w:t xml:space="preserve">. </w:t>
-      </w:r>
-      <w:r>
-        <w:rPr>
-          <w:b/>
-          <w:bCs/>
-          <w:sz w:val="22"/>
-          <w:szCs w:val="20"/>
-          <w:lang w:val="en-GB"/>
-        </w:rPr>
-        <w:t>Natural sanctions</w:t>
-      </w:r>
-      <w:r>
-        <w:rPr>
-          <w:sz w:val="22"/>
-          <w:szCs w:val="20"/>
-          <w:lang w:val="en-GB"/>
-        </w:rPr>
-        <w:t xml:space="preserve"> are, as with natural laws, to be assumed. </w:t>
-      </w:r>
-      <w:r>
-        <w:rPr>
-          <w:sz w:val="22"/>
-          <w:szCs w:val="20"/>
-          <w:lang w:val="en-GB"/>
-        </w:rPr>
-        <w:t xml:space="preserve">Those consequences are axiomatic and </w:t>
-      </w:r>
-      <w:r>
-        <w:rPr>
-          <w:sz w:val="22"/>
-          <w:szCs w:val="20"/>
-          <w:lang w:val="en-GB"/>
-        </w:rPr>
-        <w:t>ought to</w:t>
-      </w:r>
-      <w:r>
-        <w:rPr>
-          <w:sz w:val="22"/>
-          <w:szCs w:val="20"/>
-          <w:lang w:val="en-GB"/>
-        </w:rPr>
-        <w:t xml:space="preserve"> never be overlooked when providing a solution to a dilemma, as </w:t>
-      </w:r>
-      <w:r>
-        <w:rPr>
-          <w:sz w:val="22"/>
-          <w:szCs w:val="20"/>
-          <w:lang w:val="en-GB"/>
-        </w:rPr>
-        <w:t xml:space="preserve">physical safety could be hindered, both the individual’s (moral agent) or </w:t>
-      </w:r>
-      <w:r>
-        <w:rPr>
-          <w:sz w:val="22"/>
-          <w:szCs w:val="20"/>
-          <w:lang w:val="en-GB"/>
-        </w:rPr>
-        <w:t>anyone else involved.</w:t>
-      </w:r>
-    </w:p>
-    <w:p>
-      <w:pPr>
-        <w:pStyle w:val="Narracions"/>
-        <w:numPr>
-          <w:ilvl w:val="0"/>
-          <w:numId w:val="1"/>
-        </w:numPr>
-        <w:rPr>
-          <w:sz w:val="22"/>
-          <w:szCs w:val="20"/>
-          <w:lang w:val="en-GB"/>
-        </w:rPr>
-      </w:pPr>
-      <w:r>
-        <w:rPr>
-          <w:b/>
-          <w:bCs/>
-          <w:sz w:val="22"/>
-          <w:szCs w:val="20"/>
-          <w:lang w:val="en-GB"/>
-        </w:rPr>
-        <w:lastRenderedPageBreak/>
-        <w:t>Legal sanctions</w:t>
-      </w:r>
-      <w:r>
-        <w:rPr>
-          <w:sz w:val="22"/>
-          <w:szCs w:val="20"/>
-          <w:lang w:val="en-GB"/>
-        </w:rPr>
-        <w:t xml:space="preserve"> are the reason why </w:t>
-      </w:r>
-      <w:r>
-        <w:rPr>
-          <w:sz w:val="22"/>
-          <w:szCs w:val="20"/>
-          <w:lang w:val="en-GB"/>
-        </w:rPr>
-        <w:t xml:space="preserve">positive laws should not be broken nor </w:t>
-      </w:r>
-      <w:r>
-        <w:rPr>
-          <w:sz w:val="22"/>
-          <w:szCs w:val="20"/>
-          <w:lang w:val="en-GB"/>
-        </w:rPr>
-        <w:t xml:space="preserve">should illegal </w:t>
-      </w:r>
-      <w:r>
-        <w:rPr>
-          <w:sz w:val="22"/>
-          <w:szCs w:val="20"/>
-          <w:lang w:val="en-GB"/>
-        </w:rPr>
-        <w:t xml:space="preserve">actions be incentivised. They must be considered before providing the final </w:t>
-      </w:r>
-      <w:r>
-        <w:rPr>
-          <w:sz w:val="22"/>
-          <w:szCs w:val="20"/>
-          <w:lang w:val="en-GB"/>
-        </w:rPr>
-        <w:t>solution to the dilemma.</w:t>
-      </w:r>
-    </w:p>
-    <w:p>
-      <w:pPr>
-        <w:pStyle w:val="Narracions"/>
-        <w:numPr>
-          <w:ilvl w:val="0"/>
-          <w:numId w:val="1"/>
-        </w:numPr>
-        <w:rPr>
-          <w:sz w:val="22"/>
-          <w:szCs w:val="20"/>
-          <w:lang w:val="en-GB"/>
-        </w:rPr>
-      </w:pPr>
-      <w:r>
-        <w:rPr>
-          <w:b/>
-          <w:bCs/>
-          <w:sz w:val="22"/>
-          <w:szCs w:val="20"/>
-          <w:lang w:val="en-GB"/>
-        </w:rPr>
-        <w:t>Social sanctions</w:t>
-      </w:r>
-      <w:r>
-        <w:rPr>
-          <w:sz w:val="22"/>
-          <w:szCs w:val="20"/>
-          <w:lang w:val="en-GB"/>
-        </w:rPr>
-        <w:t xml:space="preserve"> are important both to pre</w:t>
-      </w:r>
-      <w:r>
-        <w:rPr>
-          <w:sz w:val="22"/>
-          <w:szCs w:val="20"/>
-          <w:lang w:val="en-GB"/>
-        </w:rPr>
-        <w:t xml:space="preserve">vent social unrest within the community the user will likely be a part of and considering </w:t>
-      </w:r>
-      <w:r>
-        <w:rPr>
-          <w:sz w:val="22"/>
-          <w:szCs w:val="20"/>
-          <w:lang w:val="en-GB"/>
-        </w:rPr>
-        <w:t xml:space="preserve">the dilemmas will be quotidian </w:t>
-      </w:r>
-      <w:r>
-        <w:rPr>
-          <w:sz w:val="22"/>
-          <w:szCs w:val="20"/>
-          <w:lang w:val="en-GB"/>
-        </w:rPr>
-        <w:t>scenes a person might encounter and solve organically.</w:t>
-      </w:r>
-    </w:p>
-    <w:p>
-      <w:pPr>
-        <w:pStyle w:val="Narracions"/>
-        <w:rPr>
-          <w:i/>
-          <w:iCs/>
-          <w:sz w:val="22"/>
-          <w:szCs w:val="20"/>
-          <w:lang w:val="en-GB"/>
-        </w:rPr>
-      </w:pPr>
-      <w:r>
-        <w:rPr>
-          <w:i/>
-          <w:iCs/>
-          <w:sz w:val="22"/>
-          <w:szCs w:val="20"/>
-          <w:lang w:val="en-GB"/>
-        </w:rPr>
-        <w:t>What schools of thought ar</w:t>
-      </w:r>
-      <w:r>
-        <w:rPr>
-          <w:i/>
-          <w:iCs/>
-          <w:sz w:val="22"/>
-          <w:szCs w:val="20"/>
-          <w:lang w:val="en-GB"/>
-        </w:rPr>
-        <w:t xml:space="preserve">e most </w:t>
-      </w:r>
-      <w:r>
-        <w:rPr>
-          <w:i/>
-          <w:iCs/>
-          <w:sz w:val="22"/>
-          <w:szCs w:val="20"/>
-          <w:lang w:val="en-GB"/>
-        </w:rPr>
-        <w:t>promising?</w:t>
-      </w:r>
-    </w:p>
-    <w:p>
-      <w:pPr>
-        <w:pStyle w:val="Narracions"/>
-        <w:numPr>
-          <w:ilvl w:val="0"/>
-          <w:numId w:val="1"/>
-        </w:numPr>
-        <w:rPr>
-          <w:sz w:val="22"/>
-          <w:szCs w:val="20"/>
-          <w:lang w:val="en-GB"/>
-        </w:rPr>
-      </w:pPr>
-      <w:r>
-        <w:rPr>
-          <w:sz w:val="22"/>
-          <w:szCs w:val="20"/>
-          <w:lang w:val="en-GB"/>
-        </w:rPr>
-        <w:t xml:space="preserve">Moral objectivism and its ten </w:t>
-      </w:r>
-      <w:r>
-        <w:rPr>
-          <w:sz w:val="22"/>
-          <w:szCs w:val="20"/>
-          <w:lang w:val="en-GB"/>
-        </w:rPr>
-        <w:t>laws.</w:t>
+          <w:sz w:val="22"/>
+          <w:szCs w:val="20"/>
+          <w:lang w:val="en-GB"/>
+        </w:rPr>
+        <w:t xml:space="preserve">Maybe moral realism, allotting </w:t>
+      </w:r>
+      <w:r>
+        <w:rPr>
+          <w:sz w:val="22"/>
+          <w:szCs w:val="20"/>
+          <w:lang w:val="en-GB"/>
+        </w:rPr>
+        <w:t>moral value to suffering?</w:t>
       </w:r>
     </w:p>
     <w:p>
@@ -3804,7 +4038,7 @@
         <w:rFonts w:ascii="Arial" w:eastAsiaTheme="minorHAnsi" w:hAnsi="Arial" w:cs="Arial" w:hint="default"/>
       </w:rPr>
     </w:lvl>
-    <w:lvl w:ilvl="1" w:tplc="04030003" w:tentative="1">
+    <w:lvl w:ilvl="1" w:tplc="04030003">
       <w:start w:val="1"/>
       <w:numFmt w:val="bullet"/>
       <w:lvlText w:val="o"/>

</xml_diff>